<commit_message>
Fix sync script's verify() resource-path bug, fill Marcus's TE placeholder
verify() pointed --resource-path at deliverables/ instead of the repo root
build_l24_deliverable_doc.sh actually cds to, so every rebuilt docx silently
lost all 9 images and the round-trip diffed on 9 figure-caption lines that
were never real content drift. Mutation-tested: reverting the path
reproduces the same 9-line false failure.

Also fills the XXX Marcus left in his latest condensing edit: Ladrillo's
1993-2026 raw thermal-expansion rate ratio is 1.27x (same cell BRICK 2.0
misses at 1.17x), per notes/scoping_2026-09-02_te_rate_vs_observations.md.

Co-Authored-By: Claude Sonnet 5 <noreply@anthropic.com>
</commit_message>
<xml_diff>
--- a/deliverables/LadrilloUpdateDescription_L24.docx
+++ b/deliverables/LadrilloUpdateDescription_L24.docx
@@ -188,7 +188,7 @@
           <w:b/>
           <w:bCs/>
         </w:rPr>
-        <w:t xml:space="preserve">FAST — the other 13 RGI regions.</w:t>
+        <w:t xml:space="preserve">FAST — 13 other RGI regions.</w:t>
       </w:r>
       <w:r>
         <w:t xml:space="preserve"> </w:t>
@@ -272,7 +272,7 @@
         <w:t xml:space="preserve"> </w:t>
       </w:r>
       <w:r>
-        <w:t xml:space="preserve">BRICK 2.0 and Ladrillo now have completely different glacier modules. Compared to MAGICC, both use the formulation from Nauels 2017 Eq. 3; where they differ is the three regions used in Ladrillo. MAGICC's committed 1850 melt is 28–136 mm, Ladrillo's 63–146 mm.</w:t>
+        <w:t xml:space="preserve">BRICK 2.0 and Ladrillo now have completely different glacier modules. MAGICC and Ladrillo both use the formulation from Nauels 2017 Eq. 3; where they differ is the three regions used in Ladrillo. MAGICC's committed 1850 melt is 28–136 mm, Ladrillo's 63–146 mm.</w:t>
       </w:r>
     </w:p>
     <w:p>
@@ -328,7 +328,7 @@
         <w:t xml:space="preserve"> </w:t>
       </w:r>
       <w:r>
-        <w:t xml:space="preserve">MAGICC assumes that once ice committed to melt in 1850 has gone, it can't be regrown, but ice past that point can be. In theory, Ladrillo can regrow up until its 1850 ice extent (and no further), but that would require temperatures to drop below 1850 levels.</w:t>
+        <w:t xml:space="preserve">MAGICC assumes that once ice committed to melt in 1850 has gone, it can't be regrown, but ice lost past that point can be. In theory, Ladrillo can regrow up until its 1850 ice extent (though no further), but that would require temperatures to drop below 1850 levels.</w:t>
       </w:r>
     </w:p>
     <w:bookmarkEnd w:id="9"/>
@@ -1662,13 +1662,13 @@
           <w:b/>
           <w:bCs/>
         </w:rPr>
-        <w:t xml:space="preserve">For thermal expansion Ladrillo is worse than BRICK 2.0, and the cause is FaIR.</w:t>
-      </w:r>
-      <w:r>
-        <w:t xml:space="preserve"> </w:t>
-      </w:r>
-      <w:r>
-        <w:t xml:space="preserve">In both models thermal expansion is</w:t>
+        <w:t xml:space="preserve">For thermal expansion Ladrillo overshoots, and the cause is FaIR.</w:t>
+      </w:r>
+      <w:r>
+        <w:t xml:space="preserve"> </w:t>
+      </w:r>
+      <w:r>
+        <w:t xml:space="preserve">In both Ladrillo and BRICK thermal expansion is</w:t>
       </w:r>
       <w:r>
         <w:t xml:space="preserve"> </w:t>
@@ -1684,7 +1684,7 @@
         <w:t xml:space="preserve"> </w:t>
       </w:r>
       <w:r>
-        <w:t xml:space="preserve">proportional to the ocean heat they are given, and both are given the same FaIR driver. This leads to both models overestimating thermal expansion (BRICK 2.0 misses the same cell at 1.17×). Against</w:t>
+        <w:t xml:space="preserve">proportional to the ocean heat they are given. When given the FaIR driver, both models overestimate thermal expansion (BRICK 2.0 misses the same cell at 1.17× compared to Ladrillo's 1.27×). Against</w:t>
       </w:r>
       <w:r>
         <w:t xml:space="preserve"> </w:t>

</xml_diff>